<commit_message>
Add 43,334-pair held-out GTDB-R207 benchmark and rewrite Table 1
Strictly held-out evaluation: 43,334 same-genus GTDB-R207 pairs
(24,831 genomes, 74 phyla) with all calibration-training genomes
excluded in both directions; dnadiff/ANIm truth computed for every
pair; gate, flag, and calibration v5 frozen beforehand.

On the 39,903 scored pairs (7.9% BELOW_DETECTION unscored by design):
calibrated v5 MAE 0.619 (bias -0.12, r 0.962) vs skani 0.957
(bias -0.80, r 0.973) on identical pairs; largest advantage at
80-85% (0.72 vs 1.98) and 85-90% (0.64 vs 0.89). Upper-95 bound
covers ANIm on 99.4% of all pairs; no calibrated score exceeds 100.

Manuscript: Table 1 gains a held-out panel, Results 2.5 gains the
held-out paragraph, the gate-circularity limitation is removed (the
gate is now validated on the frozen-pipeline held-out set), Table 3
and Methods 4.10 describe dataset (9), Supplementary Figure S2 added,
data availability updated. DOCX regenerated.
</commit_message>
<xml_diff>
--- a/paper/SUPPLEMENTARY.docx
+++ b/paper/SUPPLEMENTARY.docx
@@ -2,7 +2,7 @@
 <file path=word/document.xml><?xml version="1.0" encoding="utf-8"?>
 <w:document xmlns:w="http://schemas.openxmlformats.org/wordprocessingml/2006/main" xmlns:m="http://schemas.openxmlformats.org/officeDocument/2006/math" xmlns:r="http://schemas.openxmlformats.org/officeDocument/2006/relationships" xmlns:o="urn:schemas-microsoft-com:office:office" xmlns:v="urn:schemas-microsoft-com:vml" xmlns:w10="urn:schemas-microsoft-com:office:word" xmlns:a="http://schemas.openxmlformats.org/drawingml/2006/main" xmlns:pic="http://schemas.openxmlformats.org/drawingml/2006/picture" xmlns:wp="http://schemas.openxmlformats.org/drawingml/2006/wordprocessingDrawing">
   <w:body>
-    <w:bookmarkStart w:id="16" w:name="Xc3fcc6656da83e08d67075bda016bbdc5c3d5f9"/>
+    <w:bookmarkStart w:id="17" w:name="Xc3fcc6656da83e08d67075bda016bbdc5c3d5f9"/>
     <w:p>
       <w:pPr>
         <w:pStyle w:val="Heading1"/>
@@ -120,7 +120,141 @@
       </w:r>
     </w:p>
     <w:bookmarkEnd w:id="9"/>
-    <w:bookmarkStart w:id="10" w:name="Xb79c9bf020a903d02af45c43b651fa33d5c8e03"/>
+    <w:bookmarkStart w:id="10" w:name="Xaf75ea201c68b3991c0a496ef9b243e8e5da9b8"/>
+    <w:p>
+      <w:pPr>
+        <w:pStyle w:val="Heading2"/>
+      </w:pPr>
+      <w:r>
+        <w:t xml:space="preserve">Supplementary Figure S2 — Held-out GTDB-R207 benchmark</w:t>
+      </w:r>
+    </w:p>
+    <w:p>
+      <w:pPr>
+        <w:pStyle w:val="FirstParagraph"/>
+      </w:pPr>
+      <w:r>
+        <w:t xml:space="preserve">(</w:t>
+      </w:r>
+      <w:r>
+        <w:rPr>
+          <w:rStyle w:val="VerbatimChar"/>
+        </w:rPr>
+        <w:t xml:space="preserve">figures/report/fig_gtdb50k_heldout.png</w:t>
+      </w:r>
+      <w:r>
+        <w:t xml:space="preserve">)</w:t>
+      </w:r>
+    </w:p>
+    <w:p>
+      <w:pPr>
+        <w:pStyle w:val="BodyText"/>
+      </w:pPr>
+      <w:r>
+        <w:t xml:space="preserve">43,334 same-genus pairs sampled from GTDB R207 representatives (24,831</w:t>
+      </w:r>
+      <w:r>
+        <w:t xml:space="preserve"> </w:t>
+      </w:r>
+      <w:r>
+        <w:t xml:space="preserve">genomes, 74 phyla), with every genome of the 2,520-pair calibration training</w:t>
+      </w:r>
+      <w:r>
+        <w:t xml:space="preserve"> </w:t>
+      </w:r>
+      <w:r>
+        <w:t xml:space="preserve">matrix excluded in both directions; dnadiff/ANIm truth for all pairs. The</w:t>
+      </w:r>
+      <w:r>
+        <w:t xml:space="preserve"> </w:t>
+      </w:r>
+      <w:r>
+        <w:t xml:space="preserve">gate, consistency flag, and calibration v5 were frozen before evaluation.</w:t>
+      </w:r>
+      <w:r>
+        <w:t xml:space="preserve"> </w:t>
+      </w:r>
+      <w:r>
+        <w:t xml:space="preserve">Panels show the scored subset (n = 39,903; 3,431 BELOW_DETECTION pairs</w:t>
+      </w:r>
+      <w:r>
+        <w:t xml:space="preserve"> </w:t>
+      </w:r>
+      <w:r>
+        <w:t xml:space="preserve">unscored by design). (a) Calibrated Syn2bANI v5 vs ANIm (MAE 0.619, bias</w:t>
+      </w:r>
+      <w:r>
+        <w:t xml:space="preserve"> </w:t>
+      </w:r>
+      <w:r>
+        <w:t xml:space="preserve">-0.12, r = 0.962). (b) skani vs ANIm on the same pairs (MAE 0.957, bias</w:t>
+      </w:r>
+      <w:r>
+        <w:t xml:space="preserve"> </w:t>
+      </w:r>
+      <w:r>
+        <w:t xml:space="preserve">-0.80, r = 0.973). (c) Per-band MAE. (d) Signed-error distributions.</w:t>
+      </w:r>
+      <w:r>
+        <w:t xml:space="preserve"> </w:t>
+      </w:r>
+      <w:r>
+        <w:t xml:space="preserve">Per-pair truth, tool output, per-band and per-phylum metrics:</w:t>
+      </w:r>
+      <w:r>
+        <w:t xml:space="preserve"> </w:t>
+      </w:r>
+      <w:r>
+        <w:rPr>
+          <w:rStyle w:val="VerbatimChar"/>
+        </w:rPr>
+        <w:t xml:space="preserve">results/gtdb50k/</w:t>
+      </w:r>
+      <w:r>
+        <w:t xml:space="preserve"> </w:t>
+      </w:r>
+      <w:r>
+        <w:t xml:space="preserve">(report</w:t>
+      </w:r>
+      <w:r>
+        <w:t xml:space="preserve"> </w:t>
+      </w:r>
+      <w:r>
+        <w:rPr>
+          <w:rStyle w:val="VerbatimChar"/>
+        </w:rPr>
+        <w:t xml:space="preserve">GTDB50K_HELDOUT_REPORT.md</w:t>
+      </w:r>
+      <w:r>
+        <w:t xml:space="preserve">, metrics</w:t>
+      </w:r>
+      <w:r>
+        <w:t xml:space="preserve"> </w:t>
+      </w:r>
+      <w:r>
+        <w:rPr>
+          <w:rStyle w:val="VerbatimChar"/>
+        </w:rPr>
+        <w:t xml:space="preserve">gtdb50k_metrics.tsv</w:t>
+      </w:r>
+      <w:r>
+        <w:t xml:space="preserve">); pipeline</w:t>
+      </w:r>
+      <w:r>
+        <w:t xml:space="preserve"> </w:t>
+      </w:r>
+      <w:r>
+        <w:rPr>
+          <w:rStyle w:val="VerbatimChar"/>
+        </w:rPr>
+        <w:t xml:space="preserve">scripts/gtdb50k/</w:t>
+      </w:r>
+      <w:r>
+        <w:t xml:space="preserve">.</w:t>
+      </w:r>
+    </w:p>
+    <w:bookmarkEnd w:id="10"/>
+    <w:bookmarkStart w:id="11" w:name="Xb79c9bf020a903d02af45c43b651fa33d5c8e03"/>
     <w:p>
       <w:pPr>
         <w:pStyle w:val="Heading2"/>
@@ -446,8 +580,8 @@
         </w:tc>
       </w:tr>
     </w:tbl>
-    <w:bookmarkEnd w:id="10"/>
-    <w:bookmarkStart w:id="11" w:name="X1d1a5b89358b225a547ea735bc71b43678427f8"/>
+    <w:bookmarkEnd w:id="11"/>
+    <w:bookmarkStart w:id="12" w:name="X1d1a5b89358b225a547ea735bc71b43678427f8"/>
     <w:p>
       <w:pPr>
         <w:pStyle w:val="Heading2"/>
@@ -761,8 +895,8 @@
         </w:tc>
       </w:tr>
     </w:tbl>
-    <w:bookmarkEnd w:id="11"/>
-    <w:bookmarkStart w:id="12" w:name="X791b5905c3cbd3b80da6a27b4633a9dc2eda705"/>
+    <w:bookmarkEnd w:id="12"/>
+    <w:bookmarkStart w:id="13" w:name="X791b5905c3cbd3b80da6a27b4633a9dc2eda705"/>
     <w:p>
       <w:pPr>
         <w:pStyle w:val="Heading2"/>
@@ -971,8 +1105,8 @@
         </w:tc>
       </w:tr>
     </w:tbl>
-    <w:bookmarkEnd w:id="12"/>
-    <w:bookmarkStart w:id="13" w:name="Xe280e63292e65e7cc12ffc5dad24d6a06d19d0f"/>
+    <w:bookmarkEnd w:id="13"/>
+    <w:bookmarkStart w:id="14" w:name="Xe280e63292e65e7cc12ffc5dad24d6a06d19d0f"/>
     <w:p>
       <w:pPr>
         <w:pStyle w:val="Heading2"/>
@@ -1070,8 +1204,8 @@
         <w:t xml:space="preserve">.</w:t>
       </w:r>
     </w:p>
-    <w:bookmarkEnd w:id="13"/>
-    <w:bookmarkStart w:id="14" w:name="Xd013ccaae7d4dde06816ab37078854f863f6c97"/>
+    <w:bookmarkEnd w:id="14"/>
+    <w:bookmarkStart w:id="15" w:name="Xd013ccaae7d4dde06816ab37078854f863f6c97"/>
     <w:p>
       <w:pPr>
         <w:pStyle w:val="Heading2"/>
@@ -1242,8 +1376,8 @@
         <w:t xml:space="preserve">further is not expected to improve it (main text, Methods 4.6).</w:t>
       </w:r>
     </w:p>
-    <w:bookmarkEnd w:id="14"/>
-    <w:bookmarkStart w:id="15" w:name="X335171f238bd89d569aec4e4b5b6643057b0b49"/>
+    <w:bookmarkEnd w:id="15"/>
+    <w:bookmarkStart w:id="16" w:name="X335171f238bd89d569aec4e4b5b6643057b0b49"/>
     <w:p>
       <w:pPr>
         <w:pStyle w:val="Heading2"/>
@@ -1344,8 +1478,8 @@
         <w:t xml:space="preserve">.</w:t>
       </w:r>
     </w:p>
-    <w:bookmarkEnd w:id="15"/>
     <w:bookmarkEnd w:id="16"/>
+    <w:bookmarkEnd w:id="17"/>
     <w:sectPr>
       <w:footnotePr>
         <w:numRestart w:val="eachSect"/>

</xml_diff>

<commit_message>
Add FastANI to the 43,334-pair held-out benchmark
FastANI was run for all 43,334 held-out pairs on the HPC cluster;
reports a value for every pair on this same-genus AF-rich set.
Updated analyze_heldout.py to compare four methods (raw, calibrated,
skani, FastANI) and report FastANI non-call rates. Regenerated
fig_gtdb50k_heldout.png to show Syn2bANI/skani/FastANI scatter panels,
per-band MAE comparison, and signed-error distributions. Updated
manuscript Table 1 held-out panel, Results 2.5, and Supplementary
Figure S2 captions; regenerated DOCX files.
</commit_message>
<xml_diff>
--- a/paper/SUPPLEMENTARY.docx
+++ b/paper/SUPPLEMENTARY.docx
@@ -175,31 +175,7 @@
         <w:t xml:space="preserve"> </w:t>
       </w:r>
       <w:r>
-        <w:t xml:space="preserve">Panels show the scored subset (n = 39,903; 3,431 BELOW_DETECTION pairs</w:t>
-      </w:r>
-      <w:r>
-        <w:t xml:space="preserve"> </w:t>
-      </w:r>
-      <w:r>
-        <w:t xml:space="preserve">unscored by design). (a) Calibrated Syn2bANI v5 vs ANIm (MAE 0.619, bias</w:t>
-      </w:r>
-      <w:r>
-        <w:t xml:space="preserve"> </w:t>
-      </w:r>
-      <w:r>
-        <w:t xml:space="preserve">-0.12, r = 0.962). (b) skani vs ANIm on the same pairs (MAE 0.957, bias</w:t>
-      </w:r>
-      <w:r>
-        <w:t xml:space="preserve"> </w:t>
-      </w:r>
-      <w:r>
-        <w:t xml:space="preserve">-0.80, r = 0.973). (c) Per-band MAE. (d) Signed-error distributions.</w:t>
-      </w:r>
-      <w:r>
-        <w:t xml:space="preserve"> </w:t>
-      </w:r>
-      <w:r>
-        <w:t xml:space="preserve">Per-pair truth, tool output, per-band and per-phylum metrics:</w:t>
+        <w:t xml:space="preserve">Panels (a–c) Calibrated Syn2bANI v5, skani, and FastANI vs ANIm (MAE 0.619, 0.958, 0.977 respectively). (d) Per-band MAE. (e) Signed-error distributions: skani and FastANI carry a large negative bias at divergent bands; the calibrated estimator is centered (bias −0.12). Per-pair truth, tool output, per-band and per-phylum metrics:</w:t>
       </w:r>
       <w:r>
         <w:t xml:space="preserve"> </w:t>

</xml_diff>